<commit_message>
Add live GitHub repository URL
</commit_message>
<xml_diff>
--- a/docs/submission/QM640_Capstone_Synopsis_Building_Permits_Final.docx
+++ b/docs/submission/QM640_Capstone_Synopsis_Building_Permits_Final.docx
@@ -4256,7 +4256,7 @@
         <w:ind w:firstLine="720"/>
       </w:pPr>
       <w:r>
-        <w:t>The accompanying project repository has been initialized as ontario-building-permit-forecasting and is prepared for publication as a public GitHub repository for advisor and course-team access. The repository will contain a README, environment specification, download scripts, a data manifest, notebooks mapped to RQ1-RQ4, reusable source modules, output tables and figures, the data dictionary, and a reproducibility log. Secrets, access tokens, or private credentials will never be committed. Figure 2 in Appendix B presents the planned folder structure.</w:t>
+        <w:t>The accompanying public project repository is available at https://github.com/dgupta91114/ontario-building-permit-forecasting for advisor and course-team access. The repository will contain a README, environment specification, download scripts, a data manifest, notebooks mapped to RQ1-RQ4, reusable source modules, output tables and figures, the data dictionary, and a reproducibility log. Secrets, access tokens, or private credentials will never be committed. Figure 2 in Appendix B presents the planned folder structure.</w:t>
       </w:r>
     </w:p>
     <w:p>
@@ -10319,7 +10319,7 @@
         <w:ind w:firstLine="0"/>
       </w:pPr>
       <w:r>
-        <w:t>This appendix is referenced in the Reproducibility and GitHub Access section. The accompanying repository has been initialized locally and is organized for immediate publication to a public GitHub remote when the learner connects an account.</w:t>
+        <w:t>This appendix is referenced in the Reproducibility and GitHub Access section. The accompanying public repository is available at https://github.com/dgupta91114/ontario-building-permit-forecasting and contains the organized project structure shown below.</w:t>
       </w:r>
     </w:p>
     <w:p>

</xml_diff>